<commit_message>
Fix footer lucide import and layout
</commit_message>
<xml_diff>
--- a/Chandra/WhatsApp_Promos.docx
+++ b/Chandra/WhatsApp_Promos.docx
@@ -34,7 +34,17 @@
     </w:p>
     <w:p>
       <w:r>
-        <w:t xml:space="preserve">Secure your spot for the AI Innovation Contest powered by AWS, Google Cloud, and IBM. The $50,000 prize pool is live, and winners will be awarded by Akon and Sonu Sood. Apply here:</w:t>
+        <w:t xml:space="preserve">🚀 𝗚𝗟𝗢𝗕𝗔𝗟 𝗧𝗔𝗟𝗘𝗡𝗧 𝗛𝗨𝗡𝗧 𝟮𝟬𝟮𝟲 is LIVE! 🚀</w:t>
+      </w:r>
+    </w:p>
+    <w:p>
+      <w:r>
+        <w:t xml:space="preserve">Secure your spot for the AI Innovation Contest powered by AWS, Google Cloud, and IBM. Compete for a massive 🏆 ₹𝟱𝟬 𝗟𝗔𝗞𝗛𝗦 prize pool and unlock 𝗔𝘀𝘀𝘂𝗿𝗲𝗱 𝗜𝗻𝘁𝗲𝗿𝗻𝘀𝗵𝗶𝗽𝘀 &amp; 𝗣𝗹𝗮𝗰𝗲𝗺𝗲𝗻𝘁 𝗦𝘂𝗽𝗽𝗼𝗿𝘁 for every participant! 💼✨</w:t>
+      </w:r>
+    </w:p>
+    <w:p>
+      <w:r>
+        <w:t xml:space="preserve">Don't miss out. Apply here:</w:t>
       </w:r>
     </w:p>
     <w:p>
@@ -56,7 +66,17 @@
     </w:p>
     <w:p>
       <w:r>
-        <w:t xml:space="preserve">The Career Accelerator Contest powered by AWS, Google Cloud, and IBM is officially open. Compete for the $50,000 prize pool and an award from Akon and Sonu Sood. Submit your application here:</w:t>
+        <w:t xml:space="preserve">🚀 𝗚𝗟𝗢𝗕𝗔𝗟 𝗧𝗔𝗟𝗘𝗡𝗧 𝗛𝗨𝗡𝗧 𝟮𝟬𝟮𝟲 is LIVE! 🚀</w:t>
+      </w:r>
+    </w:p>
+    <w:p>
+      <w:r>
+        <w:t xml:space="preserve">The Career Accelerator Contest powered by AWS, Google Cloud, and IBM is officially open. Compete for a massive 🏆 ₹𝟱𝟬 𝗟𝗔𝗞𝗛𝗦 prize pool and unlock 𝗔𝘀𝘀𝘂𝗿𝗲𝗱 𝗜𝗻𝘁𝗲𝗿𝗻𝘀𝗵𝗶𝗽𝘀 &amp; 𝗣𝗹𝗮𝗰𝗲𝗺𝗲𝗻𝘁 𝗦𝘂𝗽𝗽𝗼𝗿𝘁 for every participant! 💼✨</w:t>
+      </w:r>
+    </w:p>
+    <w:p>
+      <w:r>
+        <w:t xml:space="preserve">Submit your application here:</w:t>
       </w:r>
     </w:p>
     <w:p>
@@ -78,7 +98,17 @@
     </w:p>
     <w:p>
       <w:r>
-        <w:t xml:space="preserve">Registration is now open for the 3D Asset Design Contest powered by AWS, Google Cloud, and IBM. There is a $50,000 prize pool on the line, with awards presented by Akon and Sonu Sood. Register here:</w:t>
+        <w:t xml:space="preserve">🚀 𝗚𝗟𝗢𝗕𝗔𝗟 𝗧𝗔𝗟𝗘𝗡𝗧 𝗛𝗨𝗡𝗧 𝟮𝟬𝟮𝟲 is LIVE! 🚀</w:t>
+      </w:r>
+    </w:p>
+    <w:p>
+      <w:r>
+        <w:t xml:space="preserve">Registration is now open for the 3D Asset Design Contest powered by AWS, Google Cloud, and IBM. Compete for a massive 🏆 ₹𝟱𝟬 𝗟𝗔𝗞𝗛𝗦 prize pool and unlock 𝗔𝘀𝘀𝘂𝗿𝗲𝗱 𝗜𝗻𝘁𝗲𝗿𝗻𝘀𝗵𝗶𝗽𝘀 &amp; 𝗣𝗹𝗮𝗰𝗲𝗺𝗲𝗻𝘁 𝗦𝘂𝗽𝗽𝗼𝗿𝘁 for every participant! 💼✨</w:t>
+      </w:r>
+    </w:p>
+    <w:p>
+      <w:r>
+        <w:t xml:space="preserve">Register here:</w:t>
       </w:r>
     </w:p>
     <w:p>
@@ -100,7 +130,17 @@
     </w:p>
     <w:p>
       <w:r>
-        <w:t xml:space="preserve">Applications are live for the Digital Character Design Contest powered by AWS, Google Cloud, and IBM. The prize pool is $50,000, and winners will be awarded by Akon and Sonu Sood. Apply here:</w:t>
+        <w:t xml:space="preserve">🚀 𝗚𝗟𝗢𝗕𝗔𝗟 𝗧𝗔𝗟𝗘𝗡𝗧 𝗛𝗨𝗡𝗧 𝟮𝟬𝟮𝟲 is LIVE! 🚀</w:t>
+      </w:r>
+    </w:p>
+    <w:p>
+      <w:r>
+        <w:t xml:space="preserve">Applications are live for the Digital Character Design Contest powered by AWS, Google Cloud, and IBM. Compete for a massive 🏆 ₹𝟱𝟬 𝗟𝗔𝗞𝗛𝗦 prize pool and unlock 𝗔𝘀𝘀𝘂𝗿𝗲𝗱 𝗜𝗻𝘁𝗲𝗿𝗻𝘀𝗵𝗶𝗽𝘀 &amp; 𝗣𝗹𝗮𝗰𝗲𝗺𝗲𝗻𝘁 𝗦𝘂𝗽𝗽𝗼𝗿𝘁 for every participant! 💼✨</w:t>
+      </w:r>
+    </w:p>
+    <w:p>
+      <w:r>
+        <w:t xml:space="preserve">Apply here:</w:t>
       </w:r>
     </w:p>
     <w:p>
@@ -122,7 +162,17 @@
     </w:p>
     <w:p>
       <w:r>
-        <w:t xml:space="preserve">The Web Experience Design Contest powered by AWS, Google Cloud, and IBM is now accepting applications. Compete for a $50,000 prize pool, with winners awarded by Akon and Sonu Sood. Enter here:</w:t>
+        <w:t xml:space="preserve">🚀 𝗚𝗟𝗢𝗕𝗔𝗟 𝗧𝗔𝗟𝗘𝗡𝗧 𝗛𝗨𝗡𝗧 𝟮𝟬𝟮𝟲 is LIVE! 🚀</w:t>
+      </w:r>
+    </w:p>
+    <w:p>
+      <w:r>
+        <w:t xml:space="preserve">The Web Experience Design Contest powered by AWS, Google Cloud, and IBM is now accepting applications. Compete for a massive 🏆 ₹𝟱𝟬 𝗟𝗔𝗞𝗛𝗦 prize pool and unlock 𝗔𝘀𝘀𝘂𝗿𝗲𝗱 𝗜𝗻𝘁𝗲𝗿𝗻𝘀𝗵𝗶𝗽𝘀 &amp; 𝗣𝗹𝗮𝗰𝗲𝗺𝗲𝗻𝘁 𝗦𝘂𝗽𝗽𝗼𝗿𝘁 for every participant! 💼✨</w:t>
+      </w:r>
+    </w:p>
+    <w:p>
+      <w:r>
+        <w:t xml:space="preserve">Enter here:</w:t>
       </w:r>
     </w:p>
     <w:p>
@@ -144,7 +194,17 @@
     </w:p>
     <w:p>
       <w:r>
-        <w:t xml:space="preserve">Enter the AI Education Innovation Contest powered by AWS, Google Cloud, and IBM. There is a $50,000 prize pool, and winners are awarded by Akon and Sonu Sood. Secure your entry here:</w:t>
+        <w:t xml:space="preserve">🚀 𝗚𝗟𝗢𝗕𝗔𝗟 𝗧𝗔𝗟𝗘𝗡𝗧 𝗛𝗨𝗡𝗧 𝟮𝟬𝟮𝟲 is LIVE! 🚀</w:t>
+      </w:r>
+    </w:p>
+    <w:p>
+      <w:r>
+        <w:t xml:space="preserve">Enter the AI Education Innovation Contest powered by AWS, Google Cloud, and IBM. Compete for a massive 🏆 ₹𝟱𝟬 𝗟𝗔𝗞𝗛𝗦 prize pool and unlock 𝗔𝘀𝘀𝘂𝗿𝗲𝗱 𝗜𝗻𝘁𝗲𝗿𝗻𝘀𝗵𝗶𝗽𝘀 &amp; 𝗣𝗹𝗮𝗰𝗲𝗺𝗲𝗻𝘁 𝗦𝘂𝗽𝗽𝗼𝗿𝘁 for every participant! 💼✨</w:t>
+      </w:r>
+    </w:p>
+    <w:p>
+      <w:r>
+        <w:t xml:space="preserve">Secure your entry here:</w:t>
       </w:r>
     </w:p>
     <w:p>

</xml_diff>

<commit_message>
Update chinni presentation poster with custom benefits
</commit_message>
<xml_diff>
--- a/Chandra/WhatsApp_Promos.docx
+++ b/Chandra/WhatsApp_Promos.docx
@@ -34,17 +34,17 @@
     </w:p>
     <w:p>
       <w:r>
-        <w:t xml:space="preserve">🚀 𝗚𝗟𝗢𝗕𝗔𝗟 𝗧𝗔𝗟𝗘𝗡𝗧 𝗛𝗨𝗡𝗧 𝟮𝟬𝟮𝟲 is LIVE! 🚀</w:t>
-      </w:r>
-    </w:p>
-    <w:p>
-      <w:r>
-        <w:t xml:space="preserve">Secure your spot for the AI Innovation Contest powered by AWS, Google Cloud, and IBM. Compete for a massive 🏆 ₹𝟱𝟬 𝗟𝗔𝗞𝗛𝗦 prize pool and unlock 𝗔𝘀𝘀𝘂𝗿𝗲𝗱 𝗜𝗻𝘁𝗲𝗿𝗻𝘀𝗵𝗶𝗽𝘀 &amp; 𝗣𝗹𝗮𝗰𝗲𝗺𝗲𝗻𝘁 𝗦𝘂𝗽𝗽𝗼𝗿𝘁 for every participant! 💼✨</w:t>
-      </w:r>
-    </w:p>
-    <w:p>
-      <w:r>
-        <w:t xml:space="preserve">Don't miss out. Apply here:</w:t>
+        <w:t xml:space="preserve">𝗚𝗟𝗢𝗕𝗔𝗟 𝗧𝗔𝗟𝗘𝗡𝗧 𝗛𝗨𝗡𝗧 𝟮𝟬𝟮𝟲 🌏 is LIVE! </w:t>
+      </w:r>
+    </w:p>
+    <w:p>
+      <w:r>
+        <w:t xml:space="preserve">Enter the AI Innovation Contest powered by AWS, Google Cloud, and IBM. Compete for a massive 🏆 ₹𝟱𝟬 𝗟𝗔𝗞𝗛𝗦 prize pool and unlock 𝗔𝘀𝘀𝘂𝗿𝗲𝗱 𝗜𝗻𝘁𝗲𝗿𝗻𝘀𝗵𝗶𝗽𝘀 &amp; 𝗣𝗹𝗮𝗰𝗲𝗺𝗲𝗻𝘁 𝗦𝘂𝗽𝗽𝗼𝗿𝘁 for every participant! 💼✨</w:t>
+      </w:r>
+    </w:p>
+    <w:p>
+      <w:r>
+        <w:t xml:space="preserve">Secure your entry here:</w:t>
       </w:r>
     </w:p>
     <w:p>
@@ -66,17 +66,17 @@
     </w:p>
     <w:p>
       <w:r>
-        <w:t xml:space="preserve">🚀 𝗚𝗟𝗢𝗕𝗔𝗟 𝗧𝗔𝗟𝗘𝗡𝗧 𝗛𝗨𝗡𝗧 𝟮𝟬𝟮𝟲 is LIVE! 🚀</w:t>
-      </w:r>
-    </w:p>
-    <w:p>
-      <w:r>
-        <w:t xml:space="preserve">The Career Accelerator Contest powered by AWS, Google Cloud, and IBM is officially open. Compete for a massive 🏆 ₹𝟱𝟬 𝗟𝗔𝗞𝗛𝗦 prize pool and unlock 𝗔𝘀𝘀𝘂𝗿𝗲𝗱 𝗜𝗻𝘁𝗲𝗿𝗻𝘀𝗵𝗶𝗽𝘀 &amp; 𝗣𝗹𝗮𝗰𝗲𝗺𝗲𝗻𝘁 𝗦𝘂𝗽𝗽𝗼𝗿𝘁 for every participant! 💼✨</w:t>
-      </w:r>
-    </w:p>
-    <w:p>
-      <w:r>
-        <w:t xml:space="preserve">Submit your application here:</w:t>
+        <w:t xml:space="preserve">𝗚𝗟𝗢𝗕𝗔𝗟 𝗧𝗔𝗟𝗘𝗡𝗧 𝗛𝗨𝗡𝗧 𝟮𝟬𝟮𝟲 🌏 is LIVE! </w:t>
+      </w:r>
+    </w:p>
+    <w:p>
+      <w:r>
+        <w:t xml:space="preserve">Enter the Career Accelerator Contest powered by AWS, Google Cloud, and IBM. Compete for a massive 🏆 ₹𝟱𝟬 𝗟𝗔𝗞𝗛𝗦 prize pool and unlock 𝗔𝘀𝘀𝘂𝗿𝗲𝗱 𝗜𝗻𝘁𝗲𝗿𝗻𝘀𝗵𝗶𝗽𝘀 &amp; 𝗣𝗹𝗮𝗰𝗲𝗺𝗲𝗻𝘁 𝗦𝘂𝗽𝗽𝗼𝗿𝘁 for every participant! 💼✨</w:t>
+      </w:r>
+    </w:p>
+    <w:p>
+      <w:r>
+        <w:t xml:space="preserve">Secure your entry here:</w:t>
       </w:r>
     </w:p>
     <w:p>
@@ -98,17 +98,17 @@
     </w:p>
     <w:p>
       <w:r>
-        <w:t xml:space="preserve">🚀 𝗚𝗟𝗢𝗕𝗔𝗟 𝗧𝗔𝗟𝗘𝗡𝗧 𝗛𝗨𝗡𝗧 𝟮𝟬𝟮𝟲 is LIVE! 🚀</w:t>
-      </w:r>
-    </w:p>
-    <w:p>
-      <w:r>
-        <w:t xml:space="preserve">Registration is now open for the 3D Asset Design Contest powered by AWS, Google Cloud, and IBM. Compete for a massive 🏆 ₹𝟱𝟬 𝗟𝗔𝗞𝗛𝗦 prize pool and unlock 𝗔𝘀𝘀𝘂𝗿𝗲𝗱 𝗜𝗻𝘁𝗲𝗿𝗻𝘀𝗵𝗶𝗽𝘀 &amp; 𝗣𝗹𝗮𝗰𝗲𝗺𝗲𝗻𝘁 𝗦𝘂𝗽𝗽𝗼𝗿𝘁 for every participant! 💼✨</w:t>
-      </w:r>
-    </w:p>
-    <w:p>
-      <w:r>
-        <w:t xml:space="preserve">Register here:</w:t>
+        <w:t xml:space="preserve">𝗚𝗟𝗢𝗕𝗔𝗟 𝗧𝗔𝗟𝗘𝗡𝗧 𝗛𝗨𝗡𝗧 𝟮𝟬𝟮𝟲 🌏 is LIVE! </w:t>
+      </w:r>
+    </w:p>
+    <w:p>
+      <w:r>
+        <w:t xml:space="preserve">Enter the 3D Asset Design Contest powered by AWS, Google Cloud, and IBM. Compete for a massive 🏆 ₹𝟱𝟬 𝗟𝗔𝗞𝗛𝗦 prize pool and unlock 𝗔𝘀𝘀𝘂𝗿𝗲𝗱 𝗜𝗻𝘁𝗲𝗿𝗻𝘀𝗵𝗶𝗽𝘀 &amp; 𝗣𝗹𝗮𝗰𝗲𝗺𝗲𝗻𝘁 𝗦𝘂𝗽𝗽𝗼𝗿𝘁 for every participant! 💼✨</w:t>
+      </w:r>
+    </w:p>
+    <w:p>
+      <w:r>
+        <w:t xml:space="preserve">Secure your entry here:</w:t>
       </w:r>
     </w:p>
     <w:p>
@@ -130,17 +130,17 @@
     </w:p>
     <w:p>
       <w:r>
-        <w:t xml:space="preserve">🚀 𝗚𝗟𝗢𝗕𝗔𝗟 𝗧𝗔𝗟𝗘𝗡𝗧 𝗛𝗨𝗡𝗧 𝟮𝟬𝟮𝟲 is LIVE! 🚀</w:t>
-      </w:r>
-    </w:p>
-    <w:p>
-      <w:r>
-        <w:t xml:space="preserve">Applications are live for the Digital Character Design Contest powered by AWS, Google Cloud, and IBM. Compete for a massive 🏆 ₹𝟱𝟬 𝗟𝗔𝗞𝗛𝗦 prize pool and unlock 𝗔𝘀𝘀𝘂𝗿𝗲𝗱 𝗜𝗻𝘁𝗲𝗿𝗻𝘀𝗵𝗶𝗽𝘀 &amp; 𝗣𝗹𝗮𝗰𝗲𝗺𝗲𝗻𝘁 𝗦𝘂𝗽𝗽𝗼𝗿𝘁 for every participant! 💼✨</w:t>
-      </w:r>
-    </w:p>
-    <w:p>
-      <w:r>
-        <w:t xml:space="preserve">Apply here:</w:t>
+        <w:t xml:space="preserve">𝗚𝗟𝗢𝗕𝗔𝗟 𝗧𝗔𝗟𝗘𝗡𝗧 𝗛𝗨𝗡𝗧 𝟮𝟬𝟮𝟲 🌏 is LIVE! </w:t>
+      </w:r>
+    </w:p>
+    <w:p>
+      <w:r>
+        <w:t xml:space="preserve">Enter the Digital Character Design Contest powered by AWS, Google Cloud, and IBM. Compete for a massive 🏆 ₹𝟱𝟬 𝗟𝗔𝗞𝗛𝗦 prize pool and unlock 𝗔𝘀𝘀𝘂𝗿𝗲𝗱 𝗜𝗻𝘁𝗲𝗿𝗻𝘀𝗵𝗶𝗽𝘀 &amp; 𝗣𝗹𝗮𝗰𝗲𝗺𝗲𝗻𝘁 𝗦𝘂𝗽𝗽𝗼𝗿𝘁 for every participant! 💼✨</w:t>
+      </w:r>
+    </w:p>
+    <w:p>
+      <w:r>
+        <w:t xml:space="preserve">Secure your entry here:</w:t>
       </w:r>
     </w:p>
     <w:p>
@@ -162,17 +162,17 @@
     </w:p>
     <w:p>
       <w:r>
-        <w:t xml:space="preserve">🚀 𝗚𝗟𝗢𝗕𝗔𝗟 𝗧𝗔𝗟𝗘𝗡𝗧 𝗛𝗨𝗡𝗧 𝟮𝟬𝟮𝟲 is LIVE! 🚀</w:t>
-      </w:r>
-    </w:p>
-    <w:p>
-      <w:r>
-        <w:t xml:space="preserve">The Web Experience Design Contest powered by AWS, Google Cloud, and IBM is now accepting applications. Compete for a massive 🏆 ₹𝟱𝟬 𝗟𝗔𝗞𝗛𝗦 prize pool and unlock 𝗔𝘀𝘀𝘂𝗿𝗲𝗱 𝗜𝗻𝘁𝗲𝗿𝗻𝘀𝗵𝗶𝗽𝘀 &amp; 𝗣𝗹𝗮𝗰𝗲𝗺𝗲𝗻𝘁 𝗦𝘂𝗽𝗽𝗼𝗿𝘁 for every participant! 💼✨</w:t>
-      </w:r>
-    </w:p>
-    <w:p>
-      <w:r>
-        <w:t xml:space="preserve">Enter here:</w:t>
+        <w:t xml:space="preserve">𝗚𝗟𝗢𝗕𝗔𝗟 𝗧𝗔𝗟𝗘𝗡𝗧 𝗛𝗨𝗡𝗧 𝟮𝟬𝟮𝟲 🌏 is LIVE! </w:t>
+      </w:r>
+    </w:p>
+    <w:p>
+      <w:r>
+        <w:t xml:space="preserve">Enter the Web Experience Design Contest powered by AWS, Google Cloud, and IBM. Compete for a massive 🏆 ₹𝟱𝟬 𝗟𝗔𝗞𝗛𝗦 prize pool and unlock 𝗔𝘀𝘀𝘂𝗿𝗲𝗱 𝗜𝗻𝘁𝗲𝗿𝗻𝘀𝗵𝗶𝗽𝘀 &amp; 𝗣𝗹𝗮𝗰𝗲𝗺𝗲𝗻𝘁 𝗦𝘂𝗽𝗽𝗼𝗿𝘁 for every participant! 💼✨</w:t>
+      </w:r>
+    </w:p>
+    <w:p>
+      <w:r>
+        <w:t xml:space="preserve">Secure your entry here:</w:t>
       </w:r>
     </w:p>
     <w:p>
@@ -194,7 +194,7 @@
     </w:p>
     <w:p>
       <w:r>
-        <w:t xml:space="preserve">🚀 𝗚𝗟𝗢𝗕𝗔𝗟 𝗧𝗔𝗟𝗘𝗡𝗧 𝗛𝗨𝗡𝗧 𝟮𝟬𝟮𝟲 is LIVE! 🚀</w:t>
+        <w:t xml:space="preserve">𝗚𝗟𝗢𝗕𝗔𝗟 𝗧𝗔𝗟𝗘𝗡𝗧 𝗛𝗨𝗡𝗧 𝟮𝟬𝟮𝟲 🌏 is LIVE! </w:t>
       </w:r>
     </w:p>
     <w:p>

</xml_diff>

<commit_message>
Rename: AI Education Innovation Contest → Career Accelerator Program everywhere (source, admin, user dashboard, poster scripts, OG image, T&C)
</commit_message>
<xml_diff>
--- a/Chandra/WhatsApp_Promos.docx
+++ b/Chandra/WhatsApp_Promos.docx
@@ -189,7 +189,7 @@
           <w:b/>
           <w:bCs/>
         </w:rPr>
-        <w:t xml:space="preserve">AI Education Innovation Contest</w:t>
+        <w:t xml:space="preserve">Career Accelerator Program</w:t>
       </w:r>
     </w:p>
     <w:p>
@@ -199,7 +199,7 @@
     </w:p>
     <w:p>
       <w:r>
-        <w:t xml:space="preserve">Enter the AI Education Innovation Contest powered by AWS, Google Cloud, and IBM. Compete for a massive 🏆 ₹𝟱𝟬 𝗟𝗔𝗞𝗛𝗦 prize pool and unlock 𝗔𝘀𝘀𝘂𝗿𝗲𝗱 𝗜𝗻𝘁𝗲𝗿𝗻𝘀𝗵𝗶𝗽𝘀 &amp; 𝗣𝗹𝗮𝗰𝗲𝗺𝗲𝗻𝘁 𝗦𝘂𝗽𝗽𝗼𝗿𝘁 for every participant! 💼✨</w:t>
+        <w:t xml:space="preserve">Enter the Career Accelerator Program powered by AWS, Google Cloud, and IBM. Compete for a massive 🏆 ₹𝟱𝟬 𝗟𝗔𝗞𝗛𝗦 prize pool and unlock 𝗔𝘀𝘀𝘂𝗿𝗲𝗱 𝗜𝗻𝘁𝗲𝗿𝗻𝘀𝗵𝗶𝗽𝘀 &amp; 𝗣𝗹𝗮𝗰𝗲𝗺𝗲𝗻𝘁 𝗦𝘂𝗽𝗽𝗼𝗿𝘁 for every participant! 💼✨</w:t>
       </w:r>
     </w:p>
     <w:p>
@@ -209,7 +209,7 @@
     </w:p>
     <w:p>
       <w:r>
-        <w:t xml:space="preserve">https://fundfy.app/contests/ai-education-innovation-contest?ref=chandra</w:t>
+        <w:t xml:space="preserve">https://fundfy.app/contests/career-accelerator-program?ref=chandra</w:t>
       </w:r>
     </w:p>
     <w:sectPr>

</xml_diff>

<commit_message>
Regenerate all posters: Support Fund replaces Prize Pool on all poster images
</commit_message>
<xml_diff>
--- a/Chandra/WhatsApp_Promos.docx
+++ b/Chandra/WhatsApp_Promos.docx
@@ -50,38 +50,6 @@
     <w:p>
       <w:r>
         <w:t xml:space="preserve">https://fundfy.app/contests/ai-innovation-contest?ref=chandra</w:t>
-      </w:r>
-    </w:p>
-    <w:p>
-      <w:pPr>
-        <w:spacing w:before="200"/>
-      </w:pPr>
-      <w:r>
-        <w:rPr>
-          <w:b/>
-          <w:bCs/>
-        </w:rPr>
-        <w:t xml:space="preserve">Career Accelerator Contest</w:t>
-      </w:r>
-    </w:p>
-    <w:p>
-      <w:r>
-        <w:t xml:space="preserve">𝗚𝗟𝗢𝗕𝗔𝗟 𝗧𝗔𝗟𝗘𝗡𝗧 𝗛𝗨𝗡𝗧 𝟮𝟬𝟮𝟲 🌏 is LIVE! </w:t>
-      </w:r>
-    </w:p>
-    <w:p>
-      <w:r>
-        <w:t xml:space="preserve">Enter the Career Accelerator Contest powered by AWS, Google Cloud, and IBM. Compete for a massive 🏆 ₹𝟱𝟬 𝗟𝗔𝗞𝗛𝗦 prize pool and unlock 𝗔𝘀𝘀𝘂𝗿𝗲𝗱 𝗜𝗻𝘁𝗲𝗿𝗻𝘀𝗵𝗶𝗽𝘀 &amp; 𝗣𝗹𝗮𝗰𝗲𝗺𝗲𝗻𝘁 𝗦𝘂𝗽𝗽𝗼𝗿𝘁 for every participant! 💼✨</w:t>
-      </w:r>
-    </w:p>
-    <w:p>
-      <w:r>
-        <w:t xml:space="preserve">Secure your entry here:</w:t>
-      </w:r>
-    </w:p>
-    <w:p>
-      <w:r>
-        <w:t xml:space="preserve">https://fundfy.app/contests/career-accelerator-contest?ref=chandra</w:t>
       </w:r>
     </w:p>
     <w:p>

</xml_diff>